<commit_message>
docs(bullyproof): send-ready package - M2-M8 A/B/C/D classification attached, M1 deposit invoice, settlement-channel note, word copies
</commit_message>
<xml_diff>
--- a/apps/bullyproof/docs/handover/invoice-phase1-completion.docx
+++ b/apps/bullyproof/docs/handover/invoice-phase1-completion.docx
@@ -443,6 +443,11 @@
       </w:r>
     </w:p>
     <w:p>
+      <w:r>
+        <w:t>Note: this invoice covers the clause 4(b) fee balance only. The salary component remainder under the agreed Phase 1 structure is settled through payroll with the final pay run and does not form part of this invoice.</w:t>
+      </w:r>
+    </w:p>
+    <w:p>
       <w:pPr>
         <w:pStyle w:val="Heading2"/>
       </w:pPr>

</xml_diff>